<commit_message>
ci: daily run 2026-10-03
</commit_message>
<xml_diff>
--- a/tailored/cv_clickcode-media_full-stack-web-developer-react-next-js-w.docx
+++ b/tailored/cv_clickcode-media_full-stack-web-developer-react-next-js-w.docx
@@ -12,12 +12,22 @@
     </w:p>
     <w:p>
       <w:r>
-        <w:t>Full Stack Developer (MERN / PERN / Next.js - SaaS) | Islamabad, Pakistan</w:t>
+        <w:t xml:space="preserve">Full Stack Developer (MERN / PERN / Next.js - SaaS)  </w:t>
       </w:r>
     </w:p>
     <w:p>
       <w:r>
-        <w:t>Email: muzzamilhassandev@gmail.com | Phone: +923055779207 | Portfolio: https://muzzamilhassandev.vercel.app/</w:t>
+        <w:t xml:space="preserve">Islamabad, Pakistan  </w:t>
+      </w:r>
+    </w:p>
+    <w:p>
+      <w:r>
+        <w:t xml:space="preserve">muzzamilhassandev@gmail.com | +923055779207  </w:t>
+      </w:r>
+    </w:p>
+    <w:p>
+      <w:r>
+        <w:t>https://muzzamilhassandev.vercel.app/ | https://github.com/muzzamilhassan/</w:t>
       </w:r>
     </w:p>
     <w:p>
@@ -30,7 +40,7 @@
     </w:p>
     <w:p>
       <w:r>
-        <w:t>Full Stack Developer with expertise in architecting and shipping production-grade SaaS products end-to-end on the JavaScript/TypeScript ecosystem. Proficient in React and Next.js (App Router, Server Components, SSR/ISR), TypeScript, and TanStack Query for frontend development. Backend experience includes Node.js, Express.js, and NestJS. Strong SQL database depth with PostgreSQL, MySQL, SQLite using Drizzle ORM, alongside MongoDB, Firebase, and Supabase. Built multiple SaaS platforms, CMS systems, and e-commerce solutions from the ground up, including pixel-perfect UIs, scalable REST APIs, and cross-database architectures. Experience with AI integration using LangChain, LangGraph, and OpenAI API.</w:t>
+        <w:t>Full Stack Developer with extensive experience in React/Next.js and full-stack JavaScript/TypeScript development. Proven ability to architect and ship production-grade applications end-to-end. Strong expertise in building responsive, accessible UIs with clean HTML/CSS/JavaScript and optimizing performance through SSR, caching, lazy loading, and code splitting. Experienced in working with multiple projects and technologies, demonstrating adaptability and quick learning capabilities essential for agency environments.</w:t>
       </w:r>
     </w:p>
     <w:p>
@@ -38,7 +48,12 @@
         <w:pStyle w:val="Heading2"/>
       </w:pPr>
       <w:r>
-        <w:t>TECHNICAL SKILLS</w:t>
+        <w:t>EXPERIENCE</w:t>
+      </w:r>
+    </w:p>
+    <w:p>
+      <w:r>
+        <w:t xml:space="preserve">**Full Stack Developer** | Revnix (fmr. Revnix Technologies) | Jan 2025 - Present  </w:t>
       </w:r>
     </w:p>
     <w:p>
@@ -46,7 +61,7 @@
         <w:pStyle w:val="ListBullet"/>
       </w:pPr>
       <w:r>
-        <w:t>**Frontend**: React.js, Next.js, React Native, Redux Toolkit, TanStack Query, Tailwind CSS</w:t>
+        <w:t xml:space="preserve">Architected and shipped production features for enterprise applications using Next.js App Router, TypeScript, and TanStack Query  </w:t>
       </w:r>
     </w:p>
     <w:p>
@@ -54,7 +69,7 @@
         <w:pStyle w:val="ListBullet"/>
       </w:pPr>
       <w:r>
-        <w:t>**Backend**: Node.js, Express.js, NestJS, REST API Design, JWT/OAuth2 Authentication, RBAC</w:t>
+        <w:t xml:space="preserve">Owned the full authentication and access control layer implementing JWT-based auth and flexible RBAC systems  </w:t>
       </w:r>
     </w:p>
     <w:p>
@@ -62,7 +77,7 @@
         <w:pStyle w:val="ListBullet"/>
       </w:pPr>
       <w:r>
-        <w:t>**Databases**: PostgreSQL, MySQL, SQLite, MongoDB, Drizzle ORM, Firebase, Supabase</w:t>
+        <w:t xml:space="preserve">Designed and maintained multi-database adapter systems supporting PostgreSQL, MySQL, and SQLite  </w:t>
       </w:r>
     </w:p>
     <w:p>
@@ -70,7 +85,7 @@
         <w:pStyle w:val="ListBullet"/>
       </w:pPr>
       <w:r>
-        <w:t>**CMS &amp; WordPress**: Enterprise headless CMS development (Nextly), content modeling, custom admin dashboards</w:t>
+        <w:t xml:space="preserve">Optimized performance and UX through SSR, caching, lazy loading, code splitting, and API improvements  </w:t>
       </w:r>
     </w:p>
     <w:p>
@@ -78,7 +93,7 @@
         <w:pStyle w:val="ListBullet"/>
       </w:pPr>
       <w:r>
-        <w:t>**AI Integration**: LangChain, LangGraph, OpenAI API</w:t>
+        <w:t xml:space="preserve">Built responsive, accessible UIs from Figma designs with Tailwind CSS, adhering to strict a11y and SEO standards  </w:t>
       </w:r>
     </w:p>
     <w:p>
@@ -86,84 +101,7 @@
         <w:pStyle w:val="ListBullet"/>
       </w:pPr>
       <w:r>
-        <w:t>**Cloud &amp; DevOps**: Vercel (CI/CD, Edge Functions), Docker, GitHub Actions, AWS Amplify</w:t>
-      </w:r>
-    </w:p>
-    <w:p>
-      <w:pPr>
-        <w:pStyle w:val="ListBullet"/>
-      </w:pPr>
-      <w:r>
-        <w:t>**Tools &amp; Practices**: Git, GitHub, Figma, JIRA, Component architecture, Lazy Loading, Code Splitting, SEO, a11y, Performance Optimization</w:t>
-      </w:r>
-    </w:p>
-    <w:p>
-      <w:pPr>
-        <w:pStyle w:val="Heading2"/>
-      </w:pPr>
-      <w:r>
-        <w:t>PROFESSIONAL EXPERIENCE</w:t>
-      </w:r>
-    </w:p>
-    <w:p>
-      <w:pPr>
-        <w:pStyle w:val="Heading3"/>
-      </w:pPr>
-      <w:r>
-        <w:t>Full Stack Developer | Revnix (fmr. Revnix Technologies)</w:t>
-      </w:r>
-    </w:p>
-    <w:p>
-      <w:r>
-        <w:t>*Jan 2025 - Present | Islamabad, Pakistan*</w:t>
-      </w:r>
-    </w:p>
-    <w:p>
-      <w:pPr>
-        <w:pStyle w:val="ListBullet"/>
-      </w:pPr>
-      <w:r>
-        <w:t>Architected and shipped production features for an enterprise headless CMS (Nextly) using Next.js App Router, TypeScript, and TanStack Query</w:t>
-      </w:r>
-    </w:p>
-    <w:p>
-      <w:pPr>
-        <w:pStyle w:val="ListBullet"/>
-      </w:pPr>
-      <w:r>
-        <w:t>Owned the full authentication and access control layer: JWT-based auth and a flexible RBAC system supporting multiple user roles across client organizations</w:t>
-      </w:r>
-    </w:p>
-    <w:p>
-      <w:pPr>
-        <w:pStyle w:val="ListBullet"/>
-      </w:pPr>
-      <w:r>
-        <w:t>Designed and maintained a pluggable multi-database adapter system (PostgreSQL, MySQL, SQLite)</w:t>
-      </w:r>
-    </w:p>
-    <w:p>
-      <w:pPr>
-        <w:pStyle w:val="ListBullet"/>
-      </w:pPr>
-      <w:r>
-        <w:t>Built a fully customizable admin dashboard for collections, media uploads, user roles, and system settings, replacing third-party CMS tooling</w:t>
-      </w:r>
-    </w:p>
-    <w:p>
-      <w:pPr>
-        <w:pStyle w:val="ListBullet"/>
-      </w:pPr>
-      <w:r>
-        <w:t>Delivered pixel-perfect, responsive UIs from Figma designs with Tailwind CSS, strict a11y and SEO standards</w:t>
-      </w:r>
-    </w:p>
-    <w:p>
-      <w:pPr>
-        <w:pStyle w:val="ListBullet"/>
-      </w:pPr>
-      <w:r>
-        <w:t>Optimized performance and UX through SSR, caching, lazy loading, code splitting, and API improvements</w:t>
+        <w:t>Delivered clean, maintainable code across multiple client projects with varying requirements and technologies</w:t>
       </w:r>
     </w:p>
     <w:p>
@@ -175,11 +113,8 @@
       </w:r>
     </w:p>
     <w:p>
-      <w:pPr>
-        <w:pStyle w:val="Heading3"/>
-      </w:pPr>
       <w:r>
-        <w:t>Nextly - Enterprise Headless CMS &amp; SaaS Framework (Live)</w:t>
+        <w:t xml:space="preserve">**Nextly** | Enterprise Headless CMS &amp; SaaS Framework (Live)  </w:t>
       </w:r>
     </w:p>
     <w:p>
@@ -187,7 +122,7 @@
         <w:pStyle w:val="ListBullet"/>
       </w:pPr>
       <w:r>
-        <w:t>TypeScript-first CMS framework for content-driven products inside Next.js, comparable in scope to Payload CMS or Sanity</w:t>
+        <w:t xml:space="preserve">Developed a TypeScript-first CMS framework for content-driven products using Next.js, comparable to Payload CMS or Sanity  </w:t>
       </w:r>
     </w:p>
     <w:p>
@@ -195,7 +130,7 @@
         <w:pStyle w:val="ListBullet"/>
       </w:pPr>
       <w:r>
-        <w:t>Dual-mode content workflow: code-defined models plus drag-and-drop visual builder with instant preview</w:t>
+        <w:t xml:space="preserve">Implemented dual-mode content workflow with code-defined models and drag-and-drop visual builder  </w:t>
       </w:r>
     </w:p>
     <w:p>
@@ -203,7 +138,7 @@
         <w:pStyle w:val="ListBullet"/>
       </w:pPr>
       <w:r>
-        <w:t>RBAC with permissions for team content access across multiple client organizations</w:t>
+        <w:t xml:space="preserve">Built pluggable database adapters supporting PostgreSQL, MySQL, and SQLite with zero code changes when switching  </w:t>
       </w:r>
     </w:p>
     <w:p>
@@ -211,7 +146,7 @@
         <w:pStyle w:val="ListBullet"/>
       </w:pPr>
       <w:r>
-        <w:t>PostgreSQL, MySQL, SQLite via pluggable Drizzle ORM adapters - zero code changes when switching databases</w:t>
+        <w:t xml:space="preserve">Created fully customizable admin dashboard for collections, media uploads, user roles, and system settings  </w:t>
       </w:r>
     </w:p>
     <w:p>
@@ -219,15 +154,12 @@
         <w:pStyle w:val="ListBullet"/>
       </w:pPr>
       <w:r>
-        <w:t>Fully containerized with Docker; reproducible builds and CI/CD on Vercel and self-hosted</w:t>
+        <w:t>Optimized frontend performance through SSR, caching, lazy loading, and code splitting</w:t>
       </w:r>
     </w:p>
     <w:p>
-      <w:pPr>
-        <w:pStyle w:val="Heading3"/>
-      </w:pPr>
       <w:r>
-        <w:t>RextAI - AI-Powered Content Intelligence Platform (Live)</w:t>
+        <w:t xml:space="preserve">**RextAI** | AI-Powered Content Intelligence Platform (Live)  </w:t>
       </w:r>
     </w:p>
     <w:p>
@@ -235,7 +167,7 @@
         <w:pStyle w:val="ListBullet"/>
       </w:pPr>
       <w:r>
-        <w:t>SaaS platform for AI-driven content generation, editing, and workflow automation</w:t>
+        <w:t xml:space="preserve">Developed SaaS platform for AI-driven content generation, editing, and workflow automation  </w:t>
       </w:r>
     </w:p>
     <w:p>
@@ -243,7 +175,7 @@
         <w:pStyle w:val="ListBullet"/>
       </w:pPr>
       <w:r>
-        <w:t>AI article generation editor with keyword input, E-E-A-T optimization controls, and humanization layer</w:t>
+        <w:t xml:space="preserve">Built React components and Next.js pages for headless CMS setup  </w:t>
       </w:r>
     </w:p>
     <w:p>
@@ -251,7 +183,7 @@
         <w:pStyle w:val="ListBullet"/>
       </w:pPr>
       <w:r>
-        <w:t>One-click CMS auto-publish integrating WordPress, Webflow, and Ghost APIs with OAuth flows</w:t>
+        <w:t xml:space="preserve">Implemented REST API consumption and data rendering on the frontend  </w:t>
       </w:r>
     </w:p>
     <w:p>
@@ -259,15 +191,7 @@
         <w:pStyle w:val="ListBullet"/>
       </w:pPr>
       <w:r>
-        <w:t>Frontend performance via SSR, caching, lazy loading, code splitting</w:t>
-      </w:r>
-    </w:p>
-    <w:p>
-      <w:pPr>
-        <w:pStyle w:val="Heading3"/>
-      </w:pPr>
-      <w:r>
-        <w:t>HireIQ - AI-Powered Recruitment &amp; Evaluation Platform (Live)</w:t>
+        <w:t xml:space="preserve">Created responsive layouts optimized across breakpoints  </w:t>
       </w:r>
     </w:p>
     <w:p>
@@ -275,7 +199,12 @@
         <w:pStyle w:val="ListBullet"/>
       </w:pPr>
       <w:r>
-        <w:t>AI-assisted recruitment and candidate evaluation platform built end-to-end</w:t>
+        <w:t>Optimized frontend performance with SSR, caching, lazy loading, and code splitting</w:t>
+      </w:r>
+    </w:p>
+    <w:p>
+      <w:r>
+        <w:t xml:space="preserve">**HireIQ** | AI-Powered Recruitment &amp; Evaluation Platform (Live)  </w:t>
       </w:r>
     </w:p>
     <w:p>
@@ -283,15 +212,7 @@
         <w:pStyle w:val="ListBullet"/>
       </w:pPr>
       <w:r>
-        <w:t>React/Next.js frontend with TypeScript, Node.js backend, and AI integration</w:t>
-      </w:r>
-    </w:p>
-    <w:p>
-      <w:pPr>
-        <w:pStyle w:val="Heading3"/>
-      </w:pPr>
-      <w:r>
-        <w:t>21Century Equipment - B2B Equipment Management Platform (Live)</w:t>
+        <w:t xml:space="preserve">Built React components and Next.js pages for data-driven application  </w:t>
       </w:r>
     </w:p>
     <w:p>
@@ -299,15 +220,7 @@
         <w:pStyle w:val="ListBullet"/>
       </w:pPr>
       <w:r>
-        <w:t>Next.js/React application with Redux Toolkit, Stripe integration, and Google Maps API</w:t>
-      </w:r>
-    </w:p>
-    <w:p>
-      <w:pPr>
-        <w:pStyle w:val="Heading3"/>
-      </w:pPr>
-      <w:r>
-        <w:t>4Rivers Equipment - Enterprise E-Commerce &amp; Rental Platform (Live)</w:t>
+        <w:t xml:space="preserve">Implemented state management and data fetching strategies  </w:t>
       </w:r>
     </w:p>
     <w:p>
@@ -315,15 +228,7 @@
         <w:pStyle w:val="ListBullet"/>
       </w:pPr>
       <w:r>
-        <w:t>Next.js/React application with Redux Toolkit, Stripe integration, and Google Maps API</w:t>
-      </w:r>
-    </w:p>
-    <w:p>
-      <w:pPr>
-        <w:pStyle w:val="Heading3"/>
-      </w:pPr>
-      <w:r>
-        <w:t>CodexSpot - Developer Knowledge &amp; Resource Hub (Live)</w:t>
+        <w:t xml:space="preserve">Developed responsive UIs with clean HTML/CSS/JavaScript  </w:t>
       </w:r>
     </w:p>
     <w:p>
@@ -331,7 +236,45 @@
         <w:pStyle w:val="ListBullet"/>
       </w:pPr>
       <w:r>
-        <w:t>Next.js/React application with TypeScript, PostgreSQL database, and Tailwind CSS</w:t>
+        <w:t>Optimized performance through modern frontend techniques</w:t>
+      </w:r>
+    </w:p>
+    <w:p>
+      <w:pPr>
+        <w:pStyle w:val="Heading2"/>
+      </w:pPr>
+      <w:r>
+        <w:t>SKILLS</w:t>
+      </w:r>
+    </w:p>
+    <w:p>
+      <w:r>
+        <w:t xml:space="preserve">**Frontend Development:**  </w:t>
+      </w:r>
+    </w:p>
+    <w:p>
+      <w:r>
+        <w:t>React.js, Next.js (App Router, Server Components, SSR/ISR), HTML5, CSS3, JavaScript (ES6+), TypeScript, Tailwind CSS, Responsive Design, Performance Optimization, Component Architecture, Lazy Loading, Code Splitting</w:t>
+      </w:r>
+    </w:p>
+    <w:p>
+      <w:r>
+        <w:t xml:space="preserve">**Backend Development:**  </w:t>
+      </w:r>
+    </w:p>
+    <w:p>
+      <w:r>
+        <w:t>Node.js, Express.js, REST API Design, Authentication (JWT, OAuth2), Access Control, Multi-database systems (PostgreSQL, MySQL, SQLite, MongoDB)</w:t>
+      </w:r>
+    </w:p>
+    <w:p>
+      <w:r>
+        <w:t xml:space="preserve">**Tools &amp; Practices:**  </w:t>
+      </w:r>
+    </w:p>
+    <w:p>
+      <w:r>
+        <w:t>Git, GitHub, Docker, CI/CD, Figma, JIRA, Semantic HTML, Accessible Design, SEO</w:t>
       </w:r>
     </w:p>
     <w:p>
@@ -343,29 +286,13 @@
       </w:r>
     </w:p>
     <w:p>
-      <w:pPr>
-        <w:pStyle w:val="Heading3"/>
-      </w:pPr>
       <w:r>
-        <w:t>BS in Computer Science | University of Haripur</w:t>
+        <w:t xml:space="preserve">**BS in Computer Science** | University of Haripur | Aug 2020 - Aug 2024  </w:t>
       </w:r>
     </w:p>
     <w:p>
       <w:r>
-        <w:t>*Aug 2020 - Aug 2024 | Haripur, Pakistan*</w:t>
-      </w:r>
-    </w:p>
-    <w:p>
-      <w:pPr>
-        <w:pStyle w:val="Heading2"/>
-      </w:pPr>
-      <w:r>
-        <w:t>LANGUAGES</w:t>
-      </w:r>
-    </w:p>
-    <w:p>
-      <w:r>
-        <w:t>English, Urdu</w:t>
+        <w:t>Haripur, Pakistan</w:t>
       </w:r>
     </w:p>
     <w:sectPr>

</xml_diff>